<commit_message>
Sync Adaptive Walker title with updated August 2026 CV.
Co-authored-by: Cursor <cursoragent@cursor.com>
</commit_message>
<xml_diff>
--- a/public/Docs/CV_Seokhyun Hwang_AUG2026_LETTER.docx
+++ b/public/Docs/CV_Seokhyun Hwang_AUG2026_LETTER.docx
@@ -152,7 +152,27 @@
                 <w:sz w:val="18"/>
                 <w:szCs w:val="20"/>
               </w:rPr>
-              <w:t>Human Computer Interaction</w:t>
+              <w:t>Human</w:t>
+            </w:r>
+            <w:r>
+              <w:rPr>
+                <w:rFonts w:ascii="Times New Roman" w:hAnsi="Times New Roman" w:cs="Times New Roman"/>
+                <w:b/>
+                <w:bCs/>
+                <w:sz w:val="18"/>
+                <w:szCs w:val="20"/>
+              </w:rPr>
+              <w:t>-</w:t>
+            </w:r>
+            <w:r>
+              <w:rPr>
+                <w:rFonts w:ascii="Times New Roman" w:hAnsi="Times New Roman" w:cs="Times New Roman"/>
+                <w:b/>
+                <w:bCs/>
+                <w:sz w:val="18"/>
+                <w:szCs w:val="20"/>
+              </w:rPr>
+              <w:t>Computer Interaction</w:t>
             </w:r>
             <w:r>
               <w:rPr>
@@ -1518,7 +1538,7 @@
           <w:tab w:val="left" w:pos="3200"/>
           <w:tab w:val="left" w:pos="4000"/>
           <w:tab w:val="left" w:pos="4800"/>
-          <w:tab w:val="right" w:pos="9360"/>
+          <w:tab w:val="right" w:pos="10800"/>
         </w:tabs>
         <w:wordWrap/>
         <w:spacing w:after="80" w:line="192" w:lineRule="auto"/>
@@ -1567,7 +1587,17 @@
           <w:sz w:val="18"/>
           <w:szCs w:val="20"/>
         </w:rPr>
-        <w:t>| Research Associates</w:t>
+        <w:t>| Research Associate</w:t>
+      </w:r>
+      <w:r>
+        <w:rPr>
+          <w:rFonts w:ascii="Times New Roman" w:hAnsi="Times New Roman" w:cs="Times New Roman"/>
+          <w:b/>
+          <w:bCs/>
+          <w:sz w:val="18"/>
+          <w:szCs w:val="20"/>
+        </w:rPr>
+        <w:t xml:space="preserve"> </w:t>
       </w:r>
       <w:r>
         <w:rPr>
@@ -1582,56 +1612,10 @@
       <w:r>
         <w:rPr>
           <w:rFonts w:ascii="Times New Roman" w:hAnsi="Times New Roman" w:cs="Times New Roman"/>
-          <w:b/>
-          <w:bCs/>
-          <w:sz w:val="18"/>
-          <w:szCs w:val="20"/>
-        </w:rPr>
-        <w:t xml:space="preserve">                                   </w:t>
-      </w:r>
-      <w:r>
-        <w:rPr>
-          <w:rFonts w:ascii="Times New Roman" w:hAnsi="Times New Roman" w:cs="Times New Roman"/>
-          <w:b/>
-          <w:bCs/>
-          <w:sz w:val="18"/>
-          <w:szCs w:val="20"/>
-        </w:rPr>
-        <w:t xml:space="preserve">  </w:t>
-      </w:r>
-      <w:r>
-        <w:rPr>
-          <w:rFonts w:ascii="Times New Roman" w:hAnsi="Times New Roman" w:cs="Times New Roman"/>
-          <w:b/>
-          <w:bCs/>
-          <w:sz w:val="18"/>
-          <w:szCs w:val="20"/>
-        </w:rPr>
-        <w:t xml:space="preserve">       </w:t>
-      </w:r>
-      <w:r>
-        <w:rPr>
-          <w:rFonts w:ascii="Times New Roman" w:hAnsi="Times New Roman" w:cs="Times New Roman"/>
-          <w:sz w:val="16"/>
-          <w:szCs w:val="20"/>
-        </w:rPr>
-        <w:t xml:space="preserve">Sep 2023 – </w:t>
-      </w:r>
-      <w:r>
-        <w:rPr>
-          <w:rFonts w:ascii="Times New Roman" w:hAnsi="Times New Roman" w:cs="Times New Roman"/>
-          <w:sz w:val="16"/>
-          <w:szCs w:val="20"/>
-        </w:rPr>
-        <w:t>Aug</w:t>
-      </w:r>
-      <w:r>
-        <w:rPr>
-          <w:rFonts w:ascii="Times New Roman" w:hAnsi="Times New Roman" w:cs="Times New Roman"/>
-          <w:sz w:val="16"/>
-          <w:szCs w:val="20"/>
-        </w:rPr>
-        <w:t xml:space="preserve"> 2024</w:t>
+          <w:sz w:val="16"/>
+          <w:szCs w:val="20"/>
+        </w:rPr>
+        <w:t>Sep 2023 – Aug 2024</w:t>
       </w:r>
     </w:p>
     <w:p>
@@ -2662,7 +2646,7 @@
           <w:sz w:val="18"/>
           <w:szCs w:val="20"/>
         </w:rPr>
-        <w:t xml:space="preserve">Honorable Mentions, 2024 CHI conference on Human Factors in Computing Systems | </w:t>
+        <w:t xml:space="preserve">Honorable Mention, 2024 CHI conference on Human Factors in Computing Systems | </w:t>
       </w:r>
       <w:r>
         <w:rPr>
@@ -2738,7 +2722,7 @@
           <w:sz w:val="18"/>
           <w:szCs w:val="20"/>
         </w:rPr>
-        <w:t xml:space="preserve">Honorable Mentions, 2024 CHI conference on Human Factors in Computing Systems | </w:t>
+        <w:t xml:space="preserve">Honorable Mention, 2024 CHI conference on Human Factors in Computing Systems | </w:t>
       </w:r>
       <w:r>
         <w:rPr>
@@ -2815,7 +2799,7 @@
           <w:sz w:val="18"/>
           <w:szCs w:val="20"/>
         </w:rPr>
-        <w:t xml:space="preserve">Honorable Mentions, IEEE International Symposium on Mixed and Augmented Reality | </w:t>
+        <w:t xml:space="preserve">Honorable Mention, IEEE International Symposium on Mixed and Augmented Reality | </w:t>
       </w:r>
       <w:r>
         <w:rPr>
@@ -2889,7 +2873,7 @@
           <w:sz w:val="18"/>
           <w:szCs w:val="20"/>
         </w:rPr>
-        <w:t xml:space="preserve">Honorable Mentions, International ACM Conference on Automotive UI | </w:t>
+        <w:t xml:space="preserve">Honorable Mention, International ACM Conference on Automotive UI | </w:t>
       </w:r>
       <w:r>
         <w:rPr>
@@ -4651,7 +4635,23 @@
           <w:sz w:val="16"/>
           <w:szCs w:val="16"/>
         </w:rPr>
-        <w:t xml:space="preserve">, M., Luo, Y., Kim, S., Matusik, W., Rus, D., Kim, K “Adaptive Walker: User Intention and Environmentally Aware Intelligent Walker with High-resolution Tactile and IMU Sensor.” </w:t>
+        <w:t>, M., Luo, Y., Kim, S., Matusik, W., Rus, D., Kim, K “</w:t>
+      </w:r>
+      <w:r>
+        <w:rPr>
+          <w:rFonts w:ascii="Times New Roman" w:hAnsi="Times New Roman" w:cs="Times New Roman"/>
+          <w:sz w:val="16"/>
+          <w:szCs w:val="16"/>
+        </w:rPr>
+        <w:t>Adaptive Walker: User Intention and Terrain Aware Intelligent Walker with High-Resolution Tactile and IMU Sensor</w:t>
+      </w:r>
+      <w:r>
+        <w:rPr>
+          <w:rFonts w:ascii="Times New Roman" w:hAnsi="Times New Roman" w:cs="Times New Roman"/>
+          <w:sz w:val="16"/>
+          <w:szCs w:val="16"/>
+        </w:rPr>
+        <w:t xml:space="preserve">” </w:t>
       </w:r>
       <w:r>
         <w:rPr>

</xml_diff>

<commit_message>
Add Claude launch config and refresh CV files
Adds a new `.claude/launch.json` with an `astro-dev` configuration to run `npm run dev` on port 4321. Also updates the AUG2026 CV letter documents in both DOCX and PDF formats under `public/Docs`.
</commit_message>
<xml_diff>
--- a/public/Docs/CV_Seokhyun Hwang_AUG2026_LETTER.docx
+++ b/public/Docs/CV_Seokhyun Hwang_AUG2026_LETTER.docx
@@ -1508,7 +1508,27 @@
           <w:sz w:val="16"/>
           <w:szCs w:val="18"/>
         </w:rPr>
-        <w:t>(Advisor: Wojciech Matusik &amp; Daniela Rus)</w:t>
+        <w:t>(Advisor</w:t>
+      </w:r>
+      <w:r>
+        <w:rPr>
+          <w:rFonts w:ascii="Times New Roman" w:hAnsi="Times New Roman" w:cs="Times New Roman"/>
+          <w:i/>
+          <w:iCs/>
+          <w:sz w:val="16"/>
+          <w:szCs w:val="18"/>
+        </w:rPr>
+        <w:t>s</w:t>
+      </w:r>
+      <w:r>
+        <w:rPr>
+          <w:rFonts w:ascii="Times New Roman" w:hAnsi="Times New Roman" w:cs="Times New Roman"/>
+          <w:i/>
+          <w:iCs/>
+          <w:sz w:val="16"/>
+          <w:szCs w:val="18"/>
+        </w:rPr>
+        <w:t>: Wojciech Matusik &amp; Daniela Rus)</w:t>
       </w:r>
       <w:r>
         <w:rPr>
@@ -3131,7 +3151,27 @@
           <w:sz w:val="18"/>
           <w:szCs w:val="20"/>
         </w:rPr>
-        <w:t xml:space="preserve">President Award, GIST | </w:t>
+        <w:t>President</w:t>
+      </w:r>
+      <w:r>
+        <w:rPr>
+          <w:rFonts w:ascii="Times New Roman" w:hAnsi="Times New Roman" w:cs="Times New Roman"/>
+          <w:b/>
+          <w:bCs/>
+          <w:sz w:val="18"/>
+          <w:szCs w:val="20"/>
+        </w:rPr>
+        <w:t>’s</w:t>
+      </w:r>
+      <w:r>
+        <w:rPr>
+          <w:rFonts w:ascii="Times New Roman" w:hAnsi="Times New Roman" w:cs="Times New Roman"/>
+          <w:b/>
+          <w:bCs/>
+          <w:sz w:val="18"/>
+          <w:szCs w:val="20"/>
+        </w:rPr>
+        <w:t xml:space="preserve"> Award, GIST | </w:t>
       </w:r>
       <w:r>
         <w:rPr>
@@ -4294,7 +4334,27 @@
           <w:sz w:val="16"/>
           <w:szCs w:val="16"/>
         </w:rPr>
-        <w:t>Proceedings of the ACM on Interactive, Mobile, Wearable and Ubiquitous Technologies, Vol. 9, No.3</w:t>
+        <w:t>Proceedings of the ACM on Interactive, Mobile, Wearable and Ubiquitous Technologies, Vol. 9, No.</w:t>
+      </w:r>
+      <w:r>
+        <w:rPr>
+          <w:rFonts w:ascii="Times New Roman" w:hAnsi="Times New Roman" w:cs="Times New Roman"/>
+          <w:i/>
+          <w:iCs/>
+          <w:sz w:val="16"/>
+          <w:szCs w:val="16"/>
+        </w:rPr>
+        <w:t xml:space="preserve"> </w:t>
+      </w:r>
+      <w:r>
+        <w:rPr>
+          <w:rFonts w:ascii="Times New Roman" w:hAnsi="Times New Roman" w:cs="Times New Roman"/>
+          <w:i/>
+          <w:iCs/>
+          <w:sz w:val="16"/>
+          <w:szCs w:val="16"/>
+        </w:rPr>
+        <w:t>3</w:t>
       </w:r>
     </w:p>
     <w:p>
@@ -4635,7 +4695,23 @@
           <w:sz w:val="16"/>
           <w:szCs w:val="16"/>
         </w:rPr>
-        <w:t>, M., Luo, Y., Kim, S., Matusik, W., Rus, D., Kim, K “</w:t>
+        <w:t>, M., Luo, Y., Kim, S., Matusik, W., Rus, D., Kim, K</w:t>
+      </w:r>
+      <w:r>
+        <w:rPr>
+          <w:rFonts w:ascii="Times New Roman" w:hAnsi="Times New Roman" w:cs="Times New Roman"/>
+          <w:sz w:val="16"/>
+          <w:szCs w:val="16"/>
+        </w:rPr>
+        <w:t>.</w:t>
+      </w:r>
+      <w:r>
+        <w:rPr>
+          <w:rFonts w:ascii="Times New Roman" w:hAnsi="Times New Roman" w:cs="Times New Roman"/>
+          <w:sz w:val="16"/>
+          <w:szCs w:val="16"/>
+        </w:rPr>
+        <w:t xml:space="preserve"> “</w:t>
       </w:r>
       <w:r>
         <w:rPr>
@@ -4884,15 +4960,23 @@
           <w:sz w:val="16"/>
           <w:szCs w:val="16"/>
         </w:rPr>
-        <w:t>: A Multimodal Dataset Assessing Passenger's Demands for Explanations in Highly Automated Vehicles</w:t>
-      </w:r>
-      <w:r>
-        <w:rPr>
-          <w:rFonts w:ascii="Times New Roman" w:hAnsi="Times New Roman" w:cs="Times New Roman"/>
-          <w:sz w:val="16"/>
-          <w:szCs w:val="16"/>
-        </w:rPr>
-        <w:t>.”</w:t>
+        <w:t>: A Multimodal Dataset Approach to Assessing Passengers’ Explanation Demands in Highly Automated Vehicles</w:t>
+      </w:r>
+      <w:r>
+        <w:rPr>
+          <w:rFonts w:ascii="Times New Roman" w:hAnsi="Times New Roman" w:cs="Times New Roman"/>
+          <w:sz w:val="16"/>
+          <w:szCs w:val="16"/>
+        </w:rPr>
+        <w:t>.</w:t>
+      </w:r>
+      <w:r>
+        <w:rPr>
+          <w:rFonts w:ascii="Times New Roman" w:hAnsi="Times New Roman" w:cs="Times New Roman"/>
+          <w:sz w:val="16"/>
+          <w:szCs w:val="16"/>
+        </w:rPr>
+        <w:t>”</w:t>
       </w:r>
       <w:r>
         <w:rPr>
@@ -4910,7 +4994,27 @@
           <w:sz w:val="16"/>
           <w:szCs w:val="16"/>
         </w:rPr>
-        <w:t>Proceedings of the ACM on Interactive, Mobile, Wearable and Ubiquitous Technologies, Vol. 8, No.3</w:t>
+        <w:t>Proceedings of the ACM on Interactive, Mobile, Wearable and Ubiquitous Technologies, Vol. 8, No.</w:t>
+      </w:r>
+      <w:r>
+        <w:rPr>
+          <w:rFonts w:ascii="Times New Roman" w:hAnsi="Times New Roman" w:cs="Times New Roman"/>
+          <w:i/>
+          <w:iCs/>
+          <w:sz w:val="16"/>
+          <w:szCs w:val="16"/>
+        </w:rPr>
+        <w:t xml:space="preserve"> </w:t>
+      </w:r>
+      <w:r>
+        <w:rPr>
+          <w:rFonts w:ascii="Times New Roman" w:hAnsi="Times New Roman" w:cs="Times New Roman"/>
+          <w:i/>
+          <w:iCs/>
+          <w:sz w:val="16"/>
+          <w:szCs w:val="16"/>
+        </w:rPr>
+        <w:t>3</w:t>
       </w:r>
     </w:p>
     <w:p>
@@ -5825,7 +5929,25 @@
           <w:sz w:val="16"/>
           <w:szCs w:val="16"/>
         </w:rPr>
-        <w:t xml:space="preserve"> Kim, Y., Seo, Y, and </w:t>
+        <w:t xml:space="preserve"> Kim, Y., Seo, Y</w:t>
+      </w:r>
+      <w:r>
+        <w:rPr>
+          <w:rFonts w:ascii="Times New Roman" w:eastAsia="Malgun Gothic" w:hAnsi="Times New Roman" w:cs="Times New Roman"/>
+          <w:noProof/>
+          <w:sz w:val="16"/>
+          <w:szCs w:val="16"/>
+        </w:rPr>
+        <w:t>.</w:t>
+      </w:r>
+      <w:r>
+        <w:rPr>
+          <w:rFonts w:ascii="Times New Roman" w:eastAsia="Malgun Gothic" w:hAnsi="Times New Roman" w:cs="Times New Roman"/>
+          <w:noProof/>
+          <w:sz w:val="16"/>
+          <w:szCs w:val="16"/>
+        </w:rPr>
+        <w:t xml:space="preserve">, and </w:t>
       </w:r>
       <w:r>
         <w:rPr>
@@ -6151,7 +6273,25 @@
           <w:sz w:val="16"/>
           <w:szCs w:val="16"/>
         </w:rPr>
-        <w:t xml:space="preserve"> Lee, J., Kim, Y., Seo, Y, and </w:t>
+        <w:t xml:space="preserve"> Lee, J., Kim, Y., Seo, Y</w:t>
+      </w:r>
+      <w:r>
+        <w:rPr>
+          <w:rFonts w:ascii="Times New Roman" w:eastAsia="Malgun Gothic" w:hAnsi="Times New Roman" w:cs="Times New Roman"/>
+          <w:noProof/>
+          <w:sz w:val="16"/>
+          <w:szCs w:val="16"/>
+        </w:rPr>
+        <w:t>.</w:t>
+      </w:r>
+      <w:r>
+        <w:rPr>
+          <w:rFonts w:ascii="Times New Roman" w:eastAsia="Malgun Gothic" w:hAnsi="Times New Roman" w:cs="Times New Roman"/>
+          <w:noProof/>
+          <w:sz w:val="16"/>
+          <w:szCs w:val="16"/>
+        </w:rPr>
+        <w:t xml:space="preserve">, and </w:t>
       </w:r>
       <w:r>
         <w:rPr>
@@ -6895,7 +7035,17 @@
           <w:sz w:val="16"/>
           <w:szCs w:val="16"/>
         </w:rPr>
-        <w:t>2024 IEEE ICRA Workshop on Wearable</w:t>
+        <w:t xml:space="preserve">2024 IEEE ICRA </w:t>
+      </w:r>
+      <w:r>
+        <w:rPr>
+          <w:rFonts w:ascii="Times New Roman" w:hAnsi="Times New Roman" w:cs="Times New Roman"/>
+          <w:i/>
+          <w:iCs/>
+          <w:sz w:val="16"/>
+          <w:szCs w:val="16"/>
+        </w:rPr>
+        <w:t>Workshop on Advancing Wearable Devices and Applications through Novel Design, Sensing, Actuation, and AI</w:t>
       </w:r>
     </w:p>
     <w:p>
@@ -7072,7 +7222,25 @@
           <w:sz w:val="16"/>
           <w:szCs w:val="16"/>
         </w:rPr>
-        <w:t xml:space="preserve">Gim, B., Kang, S., Kim, G, Yeo, D., </w:t>
+        <w:t>Gim, B., Kang, S., Kim, G</w:t>
+      </w:r>
+      <w:r>
+        <w:rPr>
+          <w:rFonts w:ascii="Times New Roman" w:eastAsia="Malgun Gothic" w:hAnsi="Times New Roman" w:cs="Times New Roman"/>
+          <w:noProof/>
+          <w:sz w:val="16"/>
+          <w:szCs w:val="16"/>
+        </w:rPr>
+        <w:t>.</w:t>
+      </w:r>
+      <w:r>
+        <w:rPr>
+          <w:rFonts w:ascii="Times New Roman" w:eastAsia="Malgun Gothic" w:hAnsi="Times New Roman" w:cs="Times New Roman"/>
+          <w:noProof/>
+          <w:sz w:val="16"/>
+          <w:szCs w:val="16"/>
+        </w:rPr>
+        <w:t xml:space="preserve">, Yeo, D., </w:t>
       </w:r>
       <w:r>
         <w:rPr>
@@ -7682,7 +7850,7 @@
           <w:sz w:val="16"/>
           <w:szCs w:val="16"/>
         </w:rPr>
-        <w:t xml:space="preserve">KR Patent App. </w:t>
+        <w:t xml:space="preserve">KR Patent. </w:t>
       </w:r>
       <w:r>
         <w:rPr>
@@ -7692,7 +7860,7 @@
           <w:sz w:val="16"/>
           <w:szCs w:val="16"/>
         </w:rPr>
-        <w:t>KR102541073</w:t>
+        <w:t>KR102946187B1</w:t>
       </w:r>
     </w:p>
     <w:p>
@@ -7727,6 +7895,14 @@
       <w:r>
         <w:rPr>
           <w:rFonts w:ascii="Times New Roman" w:hAnsi="Times New Roman" w:cs="Times New Roman"/>
+          <w:sz w:val="16"/>
+          <w:szCs w:val="16"/>
+        </w:rPr>
+        <w:t xml:space="preserve">Kim, S., </w:t>
+      </w:r>
+      <w:r>
+        <w:rPr>
+          <w:rFonts w:ascii="Times New Roman" w:hAnsi="Times New Roman" w:cs="Times New Roman"/>
           <w:b/>
           <w:bCs/>
           <w:sz w:val="16"/>
@@ -7741,7 +7917,15 @@
           <w:sz w:val="16"/>
           <w:szCs w:val="16"/>
         </w:rPr>
-        <w:t xml:space="preserve"> Lee, J., Kim, Y., Seo, Y., and Kim, S. “Method and System for Supporting Walking in Virtual Environment.” </w:t>
+        <w:t xml:space="preserve"> Kim, Y., Seo, Y., and Lee, J.</w:t>
+      </w:r>
+      <w:r>
+        <w:rPr>
+          <w:rFonts w:ascii="Times New Roman" w:hAnsi="Times New Roman" w:cs="Times New Roman"/>
+          <w:sz w:val="16"/>
+          <w:szCs w:val="16"/>
+        </w:rPr>
+        <w:t xml:space="preserve"> “Method and System for Supporting Walking in Virtual Environment.” </w:t>
       </w:r>
       <w:r>
         <w:rPr>
@@ -7801,7 +7985,7 @@
           <w:sz w:val="16"/>
           <w:szCs w:val="16"/>
         </w:rPr>
-        <w:t xml:space="preserve">KR Patent App. </w:t>
+        <w:t xml:space="preserve">KR Patent. </w:t>
       </w:r>
       <w:r>
         <w:rPr>
@@ -7811,7 +7995,7 @@
           <w:sz w:val="16"/>
           <w:szCs w:val="16"/>
         </w:rPr>
-        <w:t>KR20250069327A</w:t>
+        <w:t>KR102916251B1</w:t>
       </w:r>
     </w:p>
     <w:p>
@@ -10457,7 +10641,7 @@
           <w:sz w:val="18"/>
           <w:szCs w:val="20"/>
         </w:rPr>
-        <w:t>.”</w:t>
+        <w:t>”</w:t>
       </w:r>
       <w:r>
         <w:rPr>

</xml_diff>